<commit_message>
fix(em): remove awkward parentheses from changeover surface sampling and update reports
</commit_message>
<xml_diff>
--- a/OOS-261187 ScanC_O CGS E001309 S1 11MAY2026 - EM.docx
+++ b/OOS-261187 ScanC_O CGS E001309 S1 11MAY2026 - EM.docx
@@ -479,13 +479,13 @@
               </w:rPr>
               <w:t xml:space="preserve">Clea S. Garza</w:t>
               <w:br/>
-              <w:t xml:space="preserve">(Surface Sampling (Changeover) Analyst)</w:t>
+              <w:t xml:space="preserve">(Changeover Surface Sampling Analyst)</w:t>
               <w:br/>
               <w:t xml:space="preserve"/>
               <w:br/>
               <w:t xml:space="preserve">Maraya Chukwumerije and Sophia Santamaria</w:t>
               <w:br/>
-              <w:t xml:space="preserve">(Surface Sampling (Changeover) Plate Reader)</w:t>
+              <w:t xml:space="preserve">(Changeover Surface Sampling Plate Reader)</w:t>
             </w:r>
           </w:p>
           <w:p>
@@ -4939,7 +4939,7 @@
             <w:r>
               <w:t xml:space="preserve">Contact Plate:</w:t>
               <w:br/>
-              <w:t xml:space="preserve">1011695040</w:t>
+              <w:t xml:space="preserve">1011543730</w:t>
             </w:r>
           </w:p>
         </w:tc>
@@ -4951,7 +4951,7 @@
             <w:r>
               <w:t xml:space="preserve">Contact Plate:</w:t>
               <w:br/>
-              <w:t xml:space="preserve">03 Jul 2026</w:t>
+              <w:t xml:space="preserve">29SEP2026</w:t>
             </w:r>
           </w:p>
         </w:tc>
@@ -8909,25 +8909,43 @@
                 <w:sz w:val="22"/>
                 <w:szCs w:val="22"/>
               </w:rPr>
-              <w:t xml:space="preserve">Environmental Monitoring Summary:</w:t>
-              <w:br/>
-              <w:t xml:space="preserve">Personnel monitoring plates for Clea S. Garza, including left- and right-touch plates, showed no microbial growth on the date before testing (08 May 2026), the date of testing (11 May 2026), and the date after testing (12 May 2026).</w:t>
+              <w:t xml:space="preserve">The analyst involved in the changeover surface sampling plate setup, Clea S. Garza (CGS), and the analysts involved in reading the plate, Maraya Chukwumerije and Sophia Santamaria, were interviewed comprehensively. Their responses are documented throughout this investigation.</w:t>
               <w:br/>
               <w:t xml:space="preserve"/>
               <w:br/>
-              <w:t xml:space="preserve">For ISO 5 BSC E001309, daily surface sampling of four locations showed no microbial growth on the date before testing (08 May 2026). On the date of testing (11 May 2026), 1 CFU was recovered from S1 associated with Clea S. Garza. The recovery was documented under ETX-260518-0273; microbial identification indicated colony-like artifact (White, shiny, hardened, smooth area embeded on agar). Surface sampling performed on the date after testing (12 May 2026) showed no microbial growth.</w:t>
+              <w:t xml:space="preserve">The EM plates were stored in accordance with the supplier's recommendations, visually inspected before use, and verified to be within their assigned expiration dates. All materials and supplies were disinfected in accordance with MICRO-SOP-9, Cleaning and Disinfecting Procedure for Microbiology. The functionality of the incubators was verified through review of data generated by the in-house continuous monitoring system.</w:t>
               <w:br/>
               <w:t xml:space="preserve"/>
               <w:br/>
-              <w:t xml:space="preserve">Settling sampling of ISO 5 BSC E001309, including two locations, showed no microbial growth on the date before testing (08 May 2026), the date of testing (11 May 2026), and the date after testing (12 May 2026).</w:t>
+              <w:t xml:space="preserve">Changeover Surface Sampling was performed by Clea S. Garza in ISO 5 BSC E001309 located in room 117A in suite CR117 on the date of testing (11 May 2026), in accordance with MICRO-SOP-2, Environmental Monitoring of the Cleanroom Facility.</w:t>
               <w:br/>
               <w:t xml:space="preserve"/>
               <w:br/>
-              <w:t xml:space="preserve">Weekly active-air monitoring of Suite 117 conducted during the week before testing and the week of testing showed no microbial growth.</w:t>
+              <w:t xml:space="preserve">The plates were initially incubated at a temperature of 30-35°C in incubator E001031 for a minimum duration of 48 hours, commencing on 11 May 2026. Following completion of the minimum 48 hours of incubation on 13 May 2026, no microbial growth was observed. The plates were subsequently incubated for a minimum of 5 days at 20-25°C in incubator E001034, with incubation ending on 18 May 2026. At completion of the second incubation period, one colony-like artifact was observed on S1. The plate was read by Maraya Chukwumerije after the initial incubation period and by Sophia Santamaria after the second incubation period. Please see Table 1 for detailed information on the observations during the respective incubations.</w:t>
               <w:br/>
               <w:t xml:space="preserve"/>
               <w:br/>
-              <w:t xml:space="preserve">Weekly surface monitoring of the anteroom and cleanroom areas associated with Suite 117 showed no microbial growth during the week before testing or the week of testing.</w:t>
+              <w:t xml:space="preserve">The observed artifact was submitted for microbial identification under ETX-260518-0273. However, following transfer or inoculation onto fresh media, no growth was observed. Therefore, the observed artifact could not be confirmed as a viable microbial colony or reported as a confirmed colony forming unit (CFU). The lack of growth upon subculture indicates that the observation may have been nonviable material, an artifact associated with agar preparation or pouring, or another non-microbial artifact.</w:t>
+              <w:br/>
+              <w:t xml:space="preserve"/>
+              <w:br/>
+              <w:t xml:space="preserve">To evaluate environmental controls and determine whether the recovery was transient or recurring, personnel-monitoring plates for Clea S. Garza and ISO 5 BSC E001309 environmental-monitoring plates were bracketed across the testing period, as detailed in Table 2.</w:t>
+              <w:br/>
+              <w:t xml:space="preserve"/>
+              <w:br/>
+              <w:t xml:space="preserve">Upon analyzing the environmental monitoring results summarized in Table 2, personnel monitoring plates for Clea S. Garza, including left- and right-touch plates, showed no microbial growth on the date before testing (08 May 2026), the date of testing (11 May 2026), and the date after testing (12 May 2026).</w:t>
+              <w:br/>
+              <w:t xml:space="preserve"/>
+              <w:br/>
+              <w:t xml:space="preserve">For ISO 5 BSC E001309, daily surface sampling of four locations showed no microbial growth on the date before testing (09 May 2026). On the date of testing (11 May 2026), 1 CFU was recovered from S1 associated with Clea S. Garza. The recovery was documented under ETX-260518-0273; microbial identification indicated a colony-like artifact (White, shiny, hardened, smooth area embeded on agar). Surface sampling performed on the date after testing (12 May 2026) showed no microbial growth across all locations.</w:t>
+              <w:br/>
+              <w:t xml:space="preserve"/>
+              <w:br/>
+              <w:t xml:space="preserve">Settling sampling of ISO 5 BSC E001309, including two locations, showed no microbial growth on the date before testing (09 May 2026), the date of testing (11 May 2026), and the date after testing (12 May 2026).</w:t>
+              <w:br/>
+              <w:t xml:space="preserve"/>
+              <w:br/>
+              <w:t xml:space="preserve">Weekly active-air monitoring of Suite 117 conducted during the week before testing (29 April 2026) showed no microbial growth. Weekly active-air monitoring conducted during the week of testing (07 May 2026) recovered 2 CFU in Room 117 under ETX-260518-0263, which were identified as Gram-positive cocci and Gram-positive pleomorphic rods. Weekly surface monitoring of the anteroom and cleanroom areas associated with Suite 117 showed no microbial growth on 29 April 2026 or 07 May 2026.</w:t>
               <w:br/>
               <w:t xml:space="preserve"/>
               <w:br/>
@@ -8935,19 +8953,50 @@
               <w:br/>
               <w:t xml:space="preserve"/>
               <w:br/>
-              <w:t xml:space="preserve">Monthly cleaning and disinfection of the cleanroom suite, including the ISO 8 anteroom (117), ISO 7 buffer room (117A), ISO 7 cleanroom (117B), and the ISO 5 biosafety cabinets located within Room 117B, were performed on 26 April 2026 by Analyst - Tamiru Kotisso and Cuong Du - in accordance with MICRO-SOP-9, Cleaning and Disinfecting Procedure for Microbiology. All H2O2 indicators passed, confirming the successful completion and effectiveness of the monthly cleaning and disinfection activities within Rooms 117, 117A, and 117B. Additionally, routine cleaning and disinfection were performed before and after the testing activity in accordance with MICRO-SOP-9.</w:t>
+              <w:t xml:space="preserve">Monthly cleaning and disinfection of the cleanroom suite, including the ISO 8 anteroom (Room 117) and ISO 7 buffer room (Room 117A) housing ISO 5 BSC E001309, were performed on 26-Apr-2026 by Analyst - Tamiru Kotisso and Cuong Du - in accordance with MICRO-SOP-9, Cleaning and Disinfecting Procedure for Microbiology. All H2O2 indicators passed, confirming the successful completion and effectiveness of the monthly cleaning and disinfection activities within Suite 117. Additionally, routine cleaning and disinfection were performed before and after the testing activity in accordance with MICRO-SOP-9.</w:t>
               <w:br/>
               <w:t xml:space="preserve"/>
               <w:br/>
-              <w:t xml:space="preserve">It is also important to note that no samples processed by Clea S. Garza in ISO 5 BSC E001309 on the date of testing (11 May 2026) failed SCAN RDI testing.</w:t>
+              <w:t xml:space="preserve">It is also important to note that no product samples processed by Clea S. Garza in ISO 5 BSC E001309 on the date of testing (11 May 2026) failed SCAN RDI testing.</w:t>
+            </w:r>
+          </w:p>
+          <w:p>
+            <w:pPr>
+              <w:outlineLvl w:val="0"/>
+              <w:rPr>
+                <w:rFonts w:eastAsiaTheme="minorEastAsia"/>
+                <w:bCs/>
+              </w:rPr>
+            </w:pPr>
+          </w:p>
+          <w:p>
+            <w:pPr>
+              <w:outlineLvl w:val="0"/>
+              <w:rPr>
+                <w:rFonts w:ascii="Times New Roman" w:eastAsiaTheme="minorEastAsia" w:hAnsi="Times New Roman"/>
+                <w:color w:val="000000"/>
+                <w:sz w:val="22"/>
+                <w:szCs w:val="22"/>
+                <w:lang w:eastAsia="zh-CN"/>
+              </w:rPr>
+            </w:pPr>
+            <w:r>
+              <w:rPr>
+                <w:rFonts w:ascii="Times New Roman" w:eastAsiaTheme="minorEastAsia" w:hAnsi="Times New Roman"/>
+                <w:color w:val="000000"/>
+                <w:sz w:val="22"/>
+                <w:szCs w:val="22"/>
+                <w:lang w:eastAsia="zh-CN"/>
+              </w:rPr>
+              <w:t xml:space="preserve">Based on the available evidence, one colony-like artifact was observed on ScanC/O CGS E001309 S1 11MAY2026 in ISO 5 BSC E001309 on the date of testing (11 May 2026). However, the observation could not be confirmed as a viable microbial CFU because no growth was obtained following inoculation onto fresh media. Therefore, the observation represents a nonviable or non-microbial artifact, including a potential artifact associated with agar preparation or the agar-pouring process.</w:t>
               <w:br/>
               <w:t xml:space="preserve"/>
               <w:br/>
-              <w:t xml:space="preserve">Based on the available evidence, one colony-like artifact was observed on ScanC/O CGS E001309 S1 11MAY2026 in ISO 5 BSC E001309 on the date of testing (11 May 2026). However, the observation could not be confirmed as a viable microbial CFU because no growth was obtained following inoculation onto fresh media. Therefore, the observation may represent a nonviable or non-microbial artifact, including a potential artifact associated with agar preparation or the agar-pouring process.</w:t>
+              <w:t xml:space="preserve">Even if the observed artifact had represented a viable CFU, it would appear to be an isolated event. This assessment is supported by the absence of microbial recovery from Clea S. Garza's personnel-monitoring plates on the date before testing (08 May 2026), the date of testing (11 May 2026), and the date after testing (12 May 2026); the absence of growth from BSC E001309 surface samples collected on the date before testing (09 May 2026) and the date after testing (12 May 2026); and the absence of growth from ISO 5 settling plates throughout the bracketing period.</w:t>
               <w:br/>
               <w:t xml:space="preserve"/>
               <w:br/>
-              <w:t xml:space="preserve">If the observed artifact had represented a viable CFU, it would appear to be an isolated event. This assessment is supported by the absence of microbial recovery from Clea S. Garza's personnel-monitoring plates on the date before testing (08 May 2026), the date of testing (11 May 2026), and the date after testing (12 May 2026); the absence of growth from BSC E001309 surface samples collected on the date before testing and the date after testing; and the absence of growth from ISO 5 settling plates throughout the bracketing period.</w:t>
+              <w:t xml:space="preserve">Although active-air monitoring recovered 2 CFU (Gram-positive cocci and Gram-positive pleomorphic rods) in the surrounding area of Room 117 during the week of testing (07 May 2026), this recovery occurred outside the ISO 5 critical environment of BSC E001309. Furthermore, the ISO 5 Surface S1 observation yielded no growth upon subculture and was confirmed as a non-viable artifact. Therefore, a microbiological relationship between the ISO 5 surface artifact and the cleanroom active-air recovery cannot be established.</w:t>
               <w:br/>
               <w:t xml:space="preserve"/>
               <w:br/>
@@ -8955,37 +9004,6 @@
               <w:br/>
               <w:t xml:space="preserve"/>
               <w:br/>
-              <w:t xml:space="preserve">Accordingly, no systemic environmental control deficiencies were identified, and no additional corrective or preventive actions are warranted at this time beyond continued routine environmental monitoring and adherence to approved cleaning, disinfection, and aseptic procedures.</w:t>
-            </w:r>
-          </w:p>
-          <w:p>
-            <w:pPr>
-              <w:outlineLvl w:val="0"/>
-              <w:rPr>
-                <w:rFonts w:eastAsiaTheme="minorEastAsia"/>
-                <w:bCs/>
-              </w:rPr>
-            </w:pPr>
-          </w:p>
-          <w:p>
-            <w:pPr>
-              <w:outlineLvl w:val="0"/>
-              <w:rPr>
-                <w:rFonts w:ascii="Times New Roman" w:eastAsiaTheme="minorEastAsia" w:hAnsi="Times New Roman"/>
-                <w:color w:val="000000"/>
-                <w:sz w:val="22"/>
-                <w:szCs w:val="22"/>
-                <w:lang w:eastAsia="zh-CN"/>
-              </w:rPr>
-            </w:pPr>
-            <w:r>
-              <w:rPr>
-                <w:rFonts w:ascii="Times New Roman" w:eastAsiaTheme="minorEastAsia" w:hAnsi="Times New Roman"/>
-                <w:color w:val="000000"/>
-                <w:sz w:val="22"/>
-                <w:szCs w:val="22"/>
-                <w:lang w:eastAsia="zh-CN"/>
-              </w:rPr>
               <w:t xml:space="preserve">Accordingly, no systemic environmental control deficiencies were identified, and no additional corrective or preventive actions are warranted at this time beyond continued routine environmental monitoring and adherence to approved cleaning, disinfection, and aseptic procedures.</w:t>
             </w:r>
           </w:p>
@@ -10685,7 +10703,7 @@
                 <w:rFonts w:ascii="Arial" w:hAnsi="Arial"/>
                 <w:sz w:val="16"/>
               </w:rPr>
-              <w:t xml:space="preserve">Surface Sampling (Changeover) Plate (BSC E001309)</w:t>
+              <w:t xml:space="preserve">Changeover Surface Sampling Plate (BSC E001309)</w:t>
             </w:r>
           </w:p>
         </w:tc>

</xml_diff>